<commit_message>
fixed up to 11 anova need to finish activity and non parametric
</commit_message>
<xml_diff>
--- a/docs/ecostats_lectures/lecture_01/01_01_lecture_powerpoint.docx
+++ b/docs/ecostats_lectures/lecture_01/01_01_lecture_powerpoint.docx
@@ -24,7 +24,13 @@
         </w:numPr>
       </w:pPr>
       <w:r>
-        <w:t xml:space="preserve">Please look over the syllabus as it has all the details of the class and how it will run.</w:t>
+        <w:t xml:space="preserve">Please look over the syllabus as it has all the details of the class</w:t>
+      </w:r>
+      <w:r>
+        <w:t xml:space="preserve"> </w:t>
+      </w:r>
+      <w:r>
+        <w:t xml:space="preserve">and how it will run.</w:t>
       </w:r>
     </w:p>
     <w:bookmarkEnd w:id="20"/>
@@ -329,7 +335,13 @@
         </w:numPr>
       </w:pPr>
       <w:r>
-        <w:t xml:space="preserve">Way to acquire knowledge, organize it and apply it back to the real world</w:t>
+        <w:t xml:space="preserve">Way to acquire knowledge, organize it and apply it back to the real</w:t>
+      </w:r>
+      <w:r>
+        <w:t xml:space="preserve"> </w:t>
+      </w:r>
+      <w:r>
+        <w:t xml:space="preserve">world</w:t>
       </w:r>
     </w:p>
     <w:p>
@@ -341,7 +353,13 @@
         </w:numPr>
       </w:pPr>
       <w:r>
-        <w:t xml:space="preserve">Make predictions and testing these predictions using a falsifiable approach - statistics</w:t>
+        <w:t xml:space="preserve">Make predictions and testing these predictions using a falsifiable</w:t>
+      </w:r>
+      <w:r>
+        <w:t xml:space="preserve"> </w:t>
+      </w:r>
+      <w:r>
+        <w:t xml:space="preserve">approach - statistics</w:t>
       </w:r>
     </w:p>
     <w:p>
@@ -377,7 +395,13 @@
         <w:t xml:space="preserve"> </w:t>
       </w:r>
       <w:r>
-        <w:t xml:space="preserve">“analysis and interpretation of data with view towards objective evaluation of conclusions based on the data”</w:t>
+        <w:t xml:space="preserve">“analysis and interpretation of data with view towards</w:t>
+      </w:r>
+      <w:r>
+        <w:t xml:space="preserve"> </w:t>
+      </w:r>
+      <w:r>
+        <w:t xml:space="preserve">objective evaluation of conclusions based on the data”</w:t>
       </w:r>
     </w:p>
     <w:p>
@@ -465,7 +489,13 @@
         <w:pStyle w:val="FirstParagraph"/>
       </w:pPr>
       <w:r>
-        <w:t xml:space="preserve">Inductive reasoning involves observing specific cases and using them to form a general conclusion.</w:t>
+        <w:t xml:space="preserve">Inductive reasoning involves observing specific cases and using them to</w:t>
+      </w:r>
+      <w:r>
+        <w:t xml:space="preserve"> </w:t>
+      </w:r>
+      <w:r>
+        <w:t xml:space="preserve">form a general conclusion.</w:t>
       </w:r>
     </w:p>
     <w:p>
@@ -515,7 +545,21 @@
           <w:b/>
           <w:bCs/>
         </w:rPr>
-        <w:t xml:space="preserve">75 mm</w:t>
+        <w:t xml:space="preserve">75</w:t>
+      </w:r>
+      <w:r>
+        <w:rPr>
+          <w:b/>
+          <w:bCs/>
+        </w:rPr>
+        <w:t xml:space="preserve"> </w:t>
+      </w:r>
+      <w:r>
+        <w:rPr>
+          <w:b/>
+          <w:bCs/>
+        </w:rPr>
+        <w:t xml:space="preserve">mm</w:t>
       </w:r>
       <w:r>
         <w:t xml:space="preserve">.</w:t>
@@ -546,7 +590,13 @@
         <w:t xml:space="preserve"> </w:t>
       </w:r>
       <w:r>
-        <w:t xml:space="preserve">from the same tree and gets similar results.</w:t>
+        <w:t xml:space="preserve">from the same tree and gets similar</w:t>
+      </w:r>
+      <w:r>
+        <w:t xml:space="preserve"> </w:t>
+      </w:r>
+      <w:r>
+        <w:t xml:space="preserve">results.</w:t>
       </w:r>
     </w:p>
     <w:p>
@@ -612,21 +662,35 @@
           <w:b/>
           <w:bCs/>
         </w:rPr>
-        <w:t xml:space="preserve">vary in length</w:t>
-      </w:r>
-      <w:r>
-        <w:t xml:space="preserve">, but each tree tends to have a characteristic range.</w:t>
-      </w:r>
-    </w:p>
-    <w:p>
-      <w:pPr>
-        <w:pStyle w:val="FirstParagraph"/>
-      </w:pPr>
+        <w:t xml:space="preserve">vary in</w:t>
+      </w:r>
       <w:r>
         <w:rPr>
           <w:b/>
           <w:bCs/>
         </w:rPr>
+        <w:t xml:space="preserve"> </w:t>
+      </w:r>
+      <w:r>
+        <w:rPr>
+          <w:b/>
+          <w:bCs/>
+        </w:rPr>
+        <w:t xml:space="preserve">length</w:t>
+      </w:r>
+      <w:r>
+        <w:t xml:space="preserve">, but each tree tends to have a characteristic range.</w:t>
+      </w:r>
+    </w:p>
+    <w:p>
+      <w:pPr>
+        <w:pStyle w:val="FirstParagraph"/>
+      </w:pPr>
+      <w:r>
+        <w:rPr>
+          <w:b/>
+          <w:bCs/>
+        </w:rPr>
         <w:t xml:space="preserve">Conclusion (Induction):</w:t>
       </w:r>
       <w:r>
@@ -637,7 +701,21 @@
           <w:i/>
           <w:iCs/>
         </w:rPr>
-        <w:t xml:space="preserve">“Pine needle length varies by tree, but each tree seems to have a typical range of lengths.</w:t>
+        <w:t xml:space="preserve">“Pine needle length varies by tree, but</w:t>
+      </w:r>
+      <w:r>
+        <w:rPr>
+          <w:i/>
+          <w:iCs/>
+        </w:rPr>
+        <w:t xml:space="preserve"> </w:t>
+      </w:r>
+      <w:r>
+        <w:rPr>
+          <w:i/>
+          <w:iCs/>
+        </w:rPr>
+        <w:t xml:space="preserve">each tree seems to have a typical range of lengths.</w:t>
       </w:r>
     </w:p>
     <w:p>
@@ -671,7 +749,13 @@
         <w:t xml:space="preserve"> </w:t>
       </w:r>
       <w:r>
-        <w:t xml:space="preserve">to be true - based on patterns observed in a sample, and there could be exceptions.</w:t>
+        <w:t xml:space="preserve">to be true - based</w:t>
+      </w:r>
+      <w:r>
+        <w:t xml:space="preserve"> </w:t>
+      </w:r>
+      <w:r>
+        <w:t xml:space="preserve">on patterns observed in a sample, and there could be exceptions.</w:t>
       </w:r>
     </w:p>
     <w:bookmarkEnd w:id="32"/>
@@ -760,7 +844,13 @@
         <w:pStyle w:val="FirstParagraph"/>
       </w:pPr>
       <w:r>
-        <w:t xml:space="preserve">Deductive reasoning starts with a general principle and applies it to a specific case.</w:t>
+        <w:t xml:space="preserve">Deductive reasoning starts with a general principle and applies it to a</w:t>
+      </w:r>
+      <w:r>
+        <w:t xml:space="preserve"> </w:t>
+      </w:r>
+      <w:r>
+        <w:t xml:space="preserve">specific case.</w:t>
       </w:r>
     </w:p>
     <w:p>
@@ -798,7 +888,21 @@
           <w:i/>
           <w:iCs/>
         </w:rPr>
-        <w:t xml:space="preserve">Pine needles from a species of pine tree have a predictable length range (e.g., 70–80 mm).</w:t>
+        <w:t xml:space="preserve">Pine needles from a species of pine tree</w:t>
+      </w:r>
+      <w:r>
+        <w:rPr>
+          <w:i/>
+          <w:iCs/>
+        </w:rPr>
+        <w:t xml:space="preserve"> </w:t>
+      </w:r>
+      <w:r>
+        <w:rPr>
+          <w:i/>
+          <w:iCs/>
+        </w:rPr>
+        <w:t xml:space="preserve">have a predictable length range (e.g., 70–80 mm).</w:t>
       </w:r>
     </w:p>
     <w:p>
@@ -880,7 +984,13 @@
         <w:t xml:space="preserve"> </w:t>
       </w:r>
       <w:r>
-        <w:t xml:space="preserve">Check the data and confirm needles fall within this expected range.</w:t>
+        <w:t xml:space="preserve">Check the data and confirm needles fall within this</w:t>
+      </w:r>
+      <w:r>
+        <w:t xml:space="preserve"> </w:t>
+      </w:r>
+      <w:r>
+        <w:t xml:space="preserve">expected range.</w:t>
       </w:r>
     </w:p>
     <w:p>
@@ -902,7 +1012,35 @@
           <w:i/>
           <w:iCs/>
         </w:rPr>
-        <w:t xml:space="preserve">“This tree belongs the species with a needle length range of 70–80 mm, we expect its needle lengths to fall in this range.”</w:t>
+        <w:t xml:space="preserve">“This tree belongs the species with a</w:t>
+      </w:r>
+      <w:r>
+        <w:rPr>
+          <w:i/>
+          <w:iCs/>
+        </w:rPr>
+        <w:t xml:space="preserve"> </w:t>
+      </w:r>
+      <w:r>
+        <w:rPr>
+          <w:i/>
+          <w:iCs/>
+        </w:rPr>
+        <w:t xml:space="preserve">needle length range of 70–80 mm, we expect its needle lengths to fall in</w:t>
+      </w:r>
+      <w:r>
+        <w:rPr>
+          <w:i/>
+          <w:iCs/>
+        </w:rPr>
+        <w:t xml:space="preserve"> </w:t>
+      </w:r>
+      <w:r>
+        <w:rPr>
+          <w:i/>
+          <w:iCs/>
+        </w:rPr>
+        <w:t xml:space="preserve">this range.”</w:t>
       </w:r>
     </w:p>
     <w:p>
@@ -920,7 +1058,19 @@
         <w:t xml:space="preserve"> </w:t>
       </w:r>
       <w:r>
-        <w:t xml:space="preserve">because it’s based on a general rule—but if the assumption (length range) is incorrect, conclusion could still be wrong.</w:t>
+        <w:t xml:space="preserve">because it’s based on a general rule—but if</w:t>
+      </w:r>
+      <w:r>
+        <w:t xml:space="preserve"> </w:t>
+      </w:r>
+      <w:r>
+        <w:t xml:space="preserve">the assumption (length range) is incorrect, conclusion could still be</w:t>
+      </w:r>
+      <w:r>
+        <w:t xml:space="preserve"> </w:t>
+      </w:r>
+      <w:r>
+        <w:t xml:space="preserve">wrong.</w:t>
       </w:r>
     </w:p>
     <w:bookmarkEnd w:id="37"/>
@@ -1401,7 +1551,13 @@
         <w:t xml:space="preserve"> </w:t>
       </w:r>
       <w:r>
-        <w:t xml:space="preserve">- how close all our measurements are but may not be precise</w:t>
+        <w:t xml:space="preserve">- how close all our measurements are but may not be</w:t>
+      </w:r>
+      <w:r>
+        <w:t xml:space="preserve"> </w:t>
+      </w:r>
+      <w:r>
+        <w:t xml:space="preserve">precise</w:t>
       </w:r>
     </w:p>
     <w:p>

</xml_diff>